<commit_message>
rerun leave-one-attack-out, refresh results
</commit_message>
<xml_diff>
--- a/docs/Janus_Solution_Walkthrough.docx
+++ b/docs/Janus_Solution_Walkthrough.docx
@@ -1654,7 +1654,7 @@
               <w:rPr>
                 <w:sz w:val="18"/>
               </w:rPr>
-              <w:t>15.9%</w:t>
+              <w:t>17.4%</w:t>
             </w:r>
           </w:p>
         </w:tc>
@@ -1710,7 +1710,7 @@
               <w:rPr>
                 <w:sz w:val="18"/>
               </w:rPr>
-              <w:t>53.2%</w:t>
+              <w:t>60.5%</w:t>
             </w:r>
           </w:p>
         </w:tc>

</xml_diff>